<commit_message>
Prada II: templates actualizados (incluye ROJO) y «PLAZO_TEXTO» solo en letras
- plazo_a_texto devuelve solo las letras (DOCE); los templates ya escriben
  «PLAZO_TEXTO» («PLAZO») CUOTAS / «PLAZO» («PLAZO_TEXTO») MESES
- templates prada2 VERDE, AMARILLO, AZUL y ROJO con las ediciones del usuario,
  más «ETAPA» ETAPA y «ENTREGA» («ENTREGA_TEXTO») MESES

Co-Authored-By: Claude Opus 5 <noreply@anthropic.com>
Claude-Session: https://claude.ai/code/session_01129NNnvQpohsYfJ2nbgqeN
</commit_message>
<xml_diff>
--- a/app/templates/prada2/AMARILLO.docx
+++ b/app/templates/prada2/AMARILLO.docx
@@ -6,8 +6,8 @@
       <w:pPr>
         <w:widowControl/>
         <w:suppressAutoHyphens w:val="0"/>
-        <w:spacing w:before="100" w:beforeAutospacing="1" w:after="100" w:afterAutospacing="1" w:line="204" w:lineRule="auto"/>
-        <w:jc w:val="both"/>
+        <w:spacing w:before="100" w:beforeAutospacing="1" w:after="100" w:afterAutospacing="1" w:line="276" w:lineRule="auto"/>
+        <w:jc w:val="center"/>
         <w:rPr>
           <w:rFonts w:ascii="Gadugi" w:eastAsia="Times New Roman" w:hAnsi="Gadugi" w:cs="Times New Roman"/>
           <w:color w:val="auto"/>
@@ -37,7 +37,7 @@
       <w:pPr>
         <w:widowControl/>
         <w:suppressAutoHyphens w:val="0"/>
-        <w:spacing w:line="204" w:lineRule="auto"/>
+        <w:spacing w:line="276" w:lineRule="auto"/>
         <w:jc w:val="both"/>
         <w:rPr>
           <w:rFonts w:ascii="Gadugi" w:eastAsia="Times New Roman" w:hAnsi="Gadugi" w:cs="Times New Roman"/>
@@ -601,7 +601,7 @@
       <w:pPr>
         <w:widowControl/>
         <w:suppressAutoHyphens w:val="0"/>
-        <w:spacing w:line="204" w:lineRule="auto"/>
+        <w:spacing w:line="276" w:lineRule="auto"/>
         <w:jc w:val="both"/>
         <w:outlineLvl w:val="2"/>
         <w:rPr>
@@ -661,7 +661,7 @@
       <w:pPr>
         <w:widowControl/>
         <w:suppressAutoHyphens w:val="0"/>
-        <w:spacing w:line="204" w:lineRule="auto"/>
+        <w:spacing w:line="276" w:lineRule="auto"/>
         <w:jc w:val="both"/>
         <w:rPr>
           <w:rFonts w:ascii="Gadugi" w:eastAsia="Times New Roman" w:hAnsi="Gadugi" w:cs="Times New Roman"/>
@@ -810,7 +810,7 @@
       <w:pPr>
         <w:widowControl/>
         <w:suppressAutoHyphens w:val="0"/>
-        <w:spacing w:line="204" w:lineRule="auto"/>
+        <w:spacing w:line="276" w:lineRule="auto"/>
         <w:jc w:val="both"/>
         <w:outlineLvl w:val="2"/>
         <w:rPr>
@@ -870,7 +870,7 @@
       <w:pPr>
         <w:widowControl/>
         <w:suppressAutoHyphens w:val="0"/>
-        <w:spacing w:line="204" w:lineRule="auto"/>
+        <w:spacing w:line="276" w:lineRule="auto"/>
         <w:jc w:val="both"/>
         <w:rPr>
           <w:rFonts w:ascii="Gadugi" w:eastAsia="Times New Roman" w:hAnsi="Gadugi" w:cs="Times New Roman"/>
@@ -1034,7 +1034,7 @@
       <w:pPr>
         <w:widowControl/>
         <w:suppressAutoHyphens w:val="0"/>
-        <w:spacing w:line="204" w:lineRule="auto"/>
+        <w:spacing w:line="276" w:lineRule="auto"/>
         <w:jc w:val="both"/>
         <w:rPr>
           <w:rFonts w:ascii="Gadugi" w:eastAsia="Times New Roman" w:hAnsi="Gadugi" w:cs="Times New Roman"/>
@@ -1270,7 +1270,7 @@
       <w:pPr>
         <w:widowControl/>
         <w:suppressAutoHyphens w:val="0"/>
-        <w:spacing w:line="204" w:lineRule="auto"/>
+        <w:spacing w:line="276" w:lineRule="auto"/>
         <w:jc w:val="both"/>
         <w:outlineLvl w:val="2"/>
         <w:rPr>
@@ -1329,7 +1329,7 @@
     <w:p>
       <w:pPr>
         <w:pStyle w:val="NormalWeb"/>
-        <w:spacing w:before="0" w:beforeAutospacing="0" w:after="0" w:afterAutospacing="0" w:line="204" w:lineRule="auto"/>
+        <w:spacing w:before="0" w:beforeAutospacing="0" w:after="0" w:afterAutospacing="0" w:line="276" w:lineRule="auto"/>
         <w:jc w:val="both"/>
         <w:rPr>
           <w:rFonts w:ascii="Gadugi" w:hAnsi="Gadugi"/>
@@ -1432,7 +1432,7 @@
     <w:p>
       <w:pPr>
         <w:pStyle w:val="NormalWeb"/>
-        <w:spacing w:before="0" w:beforeAutospacing="0" w:after="0" w:afterAutospacing="0" w:line="204" w:lineRule="auto"/>
+        <w:spacing w:before="0" w:beforeAutospacing="0" w:after="0" w:afterAutospacing="0" w:line="276" w:lineRule="auto"/>
         <w:jc w:val="both"/>
         <w:rPr>
           <w:rFonts w:ascii="Gadugi" w:hAnsi="Gadugi"/>
@@ -1496,7 +1496,7 @@
     <w:p>
       <w:pPr>
         <w:pStyle w:val="NormalWeb"/>
-        <w:spacing w:before="0" w:beforeAutospacing="0" w:after="0" w:afterAutospacing="0" w:line="204" w:lineRule="auto"/>
+        <w:spacing w:before="0" w:beforeAutospacing="0" w:after="0" w:afterAutospacing="0" w:line="276" w:lineRule="auto"/>
         <w:jc w:val="both"/>
         <w:rPr>
           <w:rFonts w:ascii="Gadugi" w:hAnsi="Gadugi"/>
@@ -1554,7 +1554,16 @@
           <w:sz w:val="20"/>
           <w:szCs w:val="20"/>
         </w:rPr>
-        <w:t xml:space="preserve"> EN «PLAZO_TEXTO» («PLAZO») CUOTAS MENSUALES. LOS IMPORTES, FECHAS DE VENCIMIENTO Y DEMÁS DETALLES DE LOS PAGOS SE ENCUENTRAN ESTABLECIDOS EN EL CRONOGRAMA DE PAGOS QUE SE ADJUNTA A CONTINUACION Y QUE FORMA PARTE INTEGRANTE DEL PRESENTE CONTRATO.</w:t>
+        <w:t xml:space="preserve"> EN «PLAZO_TEXTO» («PLAZO») CUOTAS MENSUALES. LOS IMPORTES, FECHAS DE VENCIMIENTO Y DEMÁS DETALLES </w:t>
+      </w:r>
+      <w:r>
+        <w:rPr>
+          <w:rFonts w:ascii="Gadugi" w:hAnsi="Gadugi"/>
+          <w:sz w:val="20"/>
+          <w:szCs w:val="20"/>
+        </w:rPr>
+        <w:lastRenderedPageBreak/>
+        <w:t>DE LOS PAGOS SE ENCUENTRAN ESTABLECIDOS EN EL CRONOGRAMA DE PAGOS QUE SE ADJUNTA A CONTINUACION Y QUE FORMA PARTE INTEGRANTE DEL PRESENTE CONTRATO.</w:t>
       </w:r>
     </w:p>
     <w:tbl>
@@ -1585,7 +1594,7 @@
             <w:pPr>
               <w:widowControl/>
               <w:suppressAutoHyphens w:val="0"/>
-              <w:spacing w:line="204" w:lineRule="auto"/>
+              <w:spacing w:line="276" w:lineRule="auto"/>
               <w:jc w:val="center"/>
               <w:rPr>
                 <w:rFonts w:ascii="Gadugi" w:eastAsia="Times New Roman" w:hAnsi="Gadugi" w:cs="Calibri"/>
@@ -1622,7 +1631,7 @@
             <w:pPr>
               <w:widowControl/>
               <w:suppressAutoHyphens w:val="0"/>
-              <w:spacing w:line="204" w:lineRule="auto"/>
+              <w:spacing w:line="276" w:lineRule="auto"/>
               <w:jc w:val="center"/>
               <w:rPr>
                 <w:rFonts w:ascii="Gadugi" w:eastAsia="Times New Roman" w:hAnsi="Gadugi" w:cs="Calibri"/>
@@ -1659,7 +1668,7 @@
             <w:pPr>
               <w:widowControl/>
               <w:suppressAutoHyphens w:val="0"/>
-              <w:spacing w:line="204" w:lineRule="auto"/>
+              <w:spacing w:line="276" w:lineRule="auto"/>
               <w:jc w:val="center"/>
               <w:rPr>
                 <w:rFonts w:ascii="Gadugi" w:eastAsia="Times New Roman" w:hAnsi="Gadugi" w:cs="Calibri"/>
@@ -1702,7 +1711,7 @@
             <w:pPr>
               <w:widowControl/>
               <w:suppressAutoHyphens w:val="0"/>
-              <w:spacing w:line="204" w:lineRule="auto"/>
+              <w:spacing w:line="276" w:lineRule="auto"/>
               <w:jc w:val="center"/>
               <w:rPr>
                 <w:rFonts w:ascii="Gadugi" w:eastAsia="Times New Roman" w:hAnsi="Gadugi" w:cs="Calibri"/>
@@ -1732,7 +1741,7 @@
             <w:pPr>
               <w:widowControl/>
               <w:suppressAutoHyphens w:val="0"/>
-              <w:spacing w:line="204" w:lineRule="auto"/>
+              <w:spacing w:line="276" w:lineRule="auto"/>
               <w:jc w:val="center"/>
               <w:rPr>
                 <w:rFonts w:ascii="Gadugi" w:hAnsi="Gadugi"/>
@@ -1760,7 +1769,7 @@
             <w:pPr>
               <w:widowControl/>
               <w:suppressAutoHyphens w:val="0"/>
-              <w:spacing w:line="204" w:lineRule="auto"/>
+              <w:spacing w:line="276" w:lineRule="auto"/>
               <w:jc w:val="center"/>
               <w:rPr>
                 <w:rFonts w:ascii="Gadugi" w:hAnsi="Gadugi"/>
@@ -1795,7 +1804,7 @@
             <w:pPr>
               <w:widowControl/>
               <w:suppressAutoHyphens w:val="0"/>
-              <w:spacing w:line="204" w:lineRule="auto"/>
+              <w:spacing w:line="276" w:lineRule="auto"/>
               <w:jc w:val="center"/>
               <w:rPr>
                 <w:rFonts w:ascii="Gadugi" w:eastAsia="Times New Roman" w:hAnsi="Gadugi" w:cs="Calibri"/>
@@ -1825,7 +1834,7 @@
             <w:pPr>
               <w:widowControl/>
               <w:suppressAutoHyphens w:val="0"/>
-              <w:spacing w:line="204" w:lineRule="auto"/>
+              <w:spacing w:line="276" w:lineRule="auto"/>
               <w:jc w:val="center"/>
               <w:rPr>
                 <w:rFonts w:ascii="Gadugi" w:hAnsi="Gadugi"/>
@@ -1853,7 +1862,7 @@
             <w:pPr>
               <w:widowControl/>
               <w:suppressAutoHyphens w:val="0"/>
-              <w:spacing w:line="204" w:lineRule="auto"/>
+              <w:spacing w:line="276" w:lineRule="auto"/>
               <w:jc w:val="center"/>
               <w:rPr>
                 <w:rFonts w:ascii="Gadugi" w:hAnsi="Gadugi"/>
@@ -1888,7 +1897,7 @@
             <w:pPr>
               <w:widowControl/>
               <w:suppressAutoHyphens w:val="0"/>
-              <w:spacing w:line="204" w:lineRule="auto"/>
+              <w:spacing w:line="276" w:lineRule="auto"/>
               <w:jc w:val="center"/>
               <w:rPr>
                 <w:rFonts w:ascii="Gadugi" w:eastAsia="Times New Roman" w:hAnsi="Gadugi" w:cs="Calibri"/>
@@ -1918,7 +1927,7 @@
             <w:pPr>
               <w:widowControl/>
               <w:suppressAutoHyphens w:val="0"/>
-              <w:spacing w:line="204" w:lineRule="auto"/>
+              <w:spacing w:line="276" w:lineRule="auto"/>
               <w:jc w:val="center"/>
               <w:rPr>
                 <w:rFonts w:ascii="Gadugi" w:hAnsi="Gadugi"/>
@@ -1946,7 +1955,7 @@
             <w:pPr>
               <w:widowControl/>
               <w:suppressAutoHyphens w:val="0"/>
-              <w:spacing w:line="204" w:lineRule="auto"/>
+              <w:spacing w:line="276" w:lineRule="auto"/>
               <w:jc w:val="center"/>
               <w:rPr>
                 <w:rFonts w:ascii="Gadugi" w:hAnsi="Gadugi"/>
@@ -1981,7 +1990,7 @@
             <w:pPr>
               <w:widowControl/>
               <w:suppressAutoHyphens w:val="0"/>
-              <w:spacing w:line="204" w:lineRule="auto"/>
+              <w:spacing w:line="276" w:lineRule="auto"/>
               <w:jc w:val="center"/>
               <w:rPr>
                 <w:rFonts w:ascii="Gadugi" w:eastAsia="Times New Roman" w:hAnsi="Gadugi" w:cs="Calibri"/>
@@ -2011,7 +2020,7 @@
             <w:pPr>
               <w:widowControl/>
               <w:suppressAutoHyphens w:val="0"/>
-              <w:spacing w:line="204" w:lineRule="auto"/>
+              <w:spacing w:line="276" w:lineRule="auto"/>
               <w:jc w:val="center"/>
               <w:rPr>
                 <w:rFonts w:ascii="Gadugi" w:hAnsi="Gadugi"/>
@@ -2039,7 +2048,7 @@
             <w:pPr>
               <w:widowControl/>
               <w:suppressAutoHyphens w:val="0"/>
-              <w:spacing w:line="204" w:lineRule="auto"/>
+              <w:spacing w:line="276" w:lineRule="auto"/>
               <w:jc w:val="center"/>
               <w:rPr>
                 <w:rFonts w:ascii="Gadugi" w:hAnsi="Gadugi"/>
@@ -2074,7 +2083,7 @@
             <w:pPr>
               <w:widowControl/>
               <w:suppressAutoHyphens w:val="0"/>
-              <w:spacing w:line="204" w:lineRule="auto"/>
+              <w:spacing w:line="276" w:lineRule="auto"/>
               <w:jc w:val="center"/>
               <w:rPr>
                 <w:rFonts w:ascii="Gadugi" w:eastAsia="Times New Roman" w:hAnsi="Gadugi" w:cs="Calibri"/>
@@ -2104,7 +2113,7 @@
             <w:pPr>
               <w:widowControl/>
               <w:suppressAutoHyphens w:val="0"/>
-              <w:spacing w:line="204" w:lineRule="auto"/>
+              <w:spacing w:line="276" w:lineRule="auto"/>
               <w:jc w:val="center"/>
               <w:rPr>
                 <w:rFonts w:ascii="Gadugi" w:hAnsi="Gadugi"/>
@@ -2132,7 +2141,7 @@
             <w:pPr>
               <w:widowControl/>
               <w:suppressAutoHyphens w:val="0"/>
-              <w:spacing w:line="204" w:lineRule="auto"/>
+              <w:spacing w:line="276" w:lineRule="auto"/>
               <w:jc w:val="center"/>
               <w:rPr>
                 <w:rFonts w:ascii="Gadugi" w:hAnsi="Gadugi"/>
@@ -2167,7 +2176,7 @@
             <w:pPr>
               <w:widowControl/>
               <w:suppressAutoHyphens w:val="0"/>
-              <w:spacing w:line="204" w:lineRule="auto"/>
+              <w:spacing w:line="276" w:lineRule="auto"/>
               <w:jc w:val="center"/>
               <w:rPr>
                 <w:rFonts w:ascii="Gadugi" w:eastAsia="Times New Roman" w:hAnsi="Gadugi" w:cs="Calibri"/>
@@ -2197,7 +2206,7 @@
             <w:pPr>
               <w:widowControl/>
               <w:suppressAutoHyphens w:val="0"/>
-              <w:spacing w:line="204" w:lineRule="auto"/>
+              <w:spacing w:line="276" w:lineRule="auto"/>
               <w:jc w:val="center"/>
               <w:rPr>
                 <w:rFonts w:ascii="Gadugi" w:hAnsi="Gadugi"/>
@@ -2225,7 +2234,7 @@
             <w:pPr>
               <w:widowControl/>
               <w:suppressAutoHyphens w:val="0"/>
-              <w:spacing w:line="204" w:lineRule="auto"/>
+              <w:spacing w:line="276" w:lineRule="auto"/>
               <w:jc w:val="center"/>
               <w:rPr>
                 <w:rFonts w:ascii="Gadugi" w:hAnsi="Gadugi"/>
@@ -2260,7 +2269,7 @@
             <w:pPr>
               <w:widowControl/>
               <w:suppressAutoHyphens w:val="0"/>
-              <w:spacing w:line="204" w:lineRule="auto"/>
+              <w:spacing w:line="276" w:lineRule="auto"/>
               <w:jc w:val="center"/>
               <w:rPr>
                 <w:rFonts w:ascii="Gadugi" w:eastAsia="Times New Roman" w:hAnsi="Gadugi" w:cs="Calibri"/>
@@ -2290,7 +2299,7 @@
             <w:pPr>
               <w:widowControl/>
               <w:suppressAutoHyphens w:val="0"/>
-              <w:spacing w:line="204" w:lineRule="auto"/>
+              <w:spacing w:line="276" w:lineRule="auto"/>
               <w:jc w:val="center"/>
               <w:rPr>
                 <w:rFonts w:ascii="Gadugi" w:hAnsi="Gadugi"/>
@@ -2318,7 +2327,7 @@
             <w:pPr>
               <w:widowControl/>
               <w:suppressAutoHyphens w:val="0"/>
-              <w:spacing w:line="204" w:lineRule="auto"/>
+              <w:spacing w:line="276" w:lineRule="auto"/>
               <w:jc w:val="center"/>
               <w:rPr>
                 <w:rFonts w:ascii="Gadugi" w:hAnsi="Gadugi"/>
@@ -2353,7 +2362,7 @@
             <w:pPr>
               <w:widowControl/>
               <w:suppressAutoHyphens w:val="0"/>
-              <w:spacing w:line="204" w:lineRule="auto"/>
+              <w:spacing w:line="276" w:lineRule="auto"/>
               <w:jc w:val="center"/>
               <w:rPr>
                 <w:rFonts w:ascii="Gadugi" w:eastAsia="Times New Roman" w:hAnsi="Gadugi" w:cs="Calibri"/>
@@ -2383,7 +2392,7 @@
             <w:pPr>
               <w:widowControl/>
               <w:suppressAutoHyphens w:val="0"/>
-              <w:spacing w:line="204" w:lineRule="auto"/>
+              <w:spacing w:line="276" w:lineRule="auto"/>
               <w:jc w:val="center"/>
               <w:rPr>
                 <w:rFonts w:ascii="Gadugi" w:hAnsi="Gadugi"/>
@@ -2411,7 +2420,7 @@
             <w:pPr>
               <w:widowControl/>
               <w:suppressAutoHyphens w:val="0"/>
-              <w:spacing w:line="204" w:lineRule="auto"/>
+              <w:spacing w:line="276" w:lineRule="auto"/>
               <w:jc w:val="center"/>
               <w:rPr>
                 <w:rFonts w:ascii="Gadugi" w:hAnsi="Gadugi"/>
@@ -2446,7 +2455,7 @@
             <w:pPr>
               <w:widowControl/>
               <w:suppressAutoHyphens w:val="0"/>
-              <w:spacing w:line="204" w:lineRule="auto"/>
+              <w:spacing w:line="276" w:lineRule="auto"/>
               <w:jc w:val="center"/>
               <w:rPr>
                 <w:rFonts w:ascii="Gadugi" w:eastAsia="Times New Roman" w:hAnsi="Gadugi" w:cs="Calibri"/>
@@ -2476,7 +2485,7 @@
             <w:pPr>
               <w:widowControl/>
               <w:suppressAutoHyphens w:val="0"/>
-              <w:spacing w:line="204" w:lineRule="auto"/>
+              <w:spacing w:line="276" w:lineRule="auto"/>
               <w:jc w:val="center"/>
               <w:rPr>
                 <w:rFonts w:ascii="Gadugi" w:hAnsi="Gadugi"/>
@@ -2504,7 +2513,7 @@
             <w:pPr>
               <w:widowControl/>
               <w:suppressAutoHyphens w:val="0"/>
-              <w:spacing w:line="204" w:lineRule="auto"/>
+              <w:spacing w:line="276" w:lineRule="auto"/>
               <w:jc w:val="center"/>
               <w:rPr>
                 <w:rFonts w:ascii="Gadugi" w:hAnsi="Gadugi"/>
@@ -2539,7 +2548,7 @@
             <w:pPr>
               <w:widowControl/>
               <w:suppressAutoHyphens w:val="0"/>
-              <w:spacing w:line="204" w:lineRule="auto"/>
+              <w:spacing w:line="276" w:lineRule="auto"/>
               <w:jc w:val="center"/>
               <w:rPr>
                 <w:rFonts w:ascii="Gadugi" w:eastAsia="Times New Roman" w:hAnsi="Gadugi" w:cs="Calibri"/>
@@ -2555,7 +2564,6 @@
                 <w:sz w:val="20"/>
                 <w:szCs w:val="20"/>
               </w:rPr>
-              <w:lastRenderedPageBreak/>
               <w:t>10</w:t>
             </w:r>
           </w:p>
@@ -2570,7 +2578,7 @@
             <w:pPr>
               <w:widowControl/>
               <w:suppressAutoHyphens w:val="0"/>
-              <w:spacing w:line="204" w:lineRule="auto"/>
+              <w:spacing w:line="276" w:lineRule="auto"/>
               <w:jc w:val="center"/>
               <w:rPr>
                 <w:rFonts w:ascii="Gadugi" w:hAnsi="Gadugi"/>
@@ -2598,7 +2606,7 @@
             <w:pPr>
               <w:widowControl/>
               <w:suppressAutoHyphens w:val="0"/>
-              <w:spacing w:line="204" w:lineRule="auto"/>
+              <w:spacing w:line="276" w:lineRule="auto"/>
               <w:jc w:val="center"/>
               <w:rPr>
                 <w:rFonts w:ascii="Gadugi" w:hAnsi="Gadugi"/>
@@ -2633,7 +2641,7 @@
             <w:pPr>
               <w:widowControl/>
               <w:suppressAutoHyphens w:val="0"/>
-              <w:spacing w:line="204" w:lineRule="auto"/>
+              <w:spacing w:line="276" w:lineRule="auto"/>
               <w:jc w:val="center"/>
               <w:rPr>
                 <w:rFonts w:ascii="Gadugi" w:eastAsia="Times New Roman" w:hAnsi="Gadugi" w:cs="Calibri"/>
@@ -2663,7 +2671,7 @@
             <w:pPr>
               <w:widowControl/>
               <w:suppressAutoHyphens w:val="0"/>
-              <w:spacing w:line="204" w:lineRule="auto"/>
+              <w:spacing w:line="276" w:lineRule="auto"/>
               <w:jc w:val="center"/>
               <w:rPr>
                 <w:rFonts w:ascii="Gadugi" w:hAnsi="Gadugi"/>
@@ -2691,7 +2699,7 @@
             <w:pPr>
               <w:widowControl/>
               <w:suppressAutoHyphens w:val="0"/>
-              <w:spacing w:line="204" w:lineRule="auto"/>
+              <w:spacing w:line="276" w:lineRule="auto"/>
               <w:jc w:val="center"/>
               <w:rPr>
                 <w:rFonts w:ascii="Gadugi" w:hAnsi="Gadugi"/>
@@ -2726,7 +2734,7 @@
             <w:pPr>
               <w:widowControl/>
               <w:suppressAutoHyphens w:val="0"/>
-              <w:spacing w:line="204" w:lineRule="auto"/>
+              <w:spacing w:line="276" w:lineRule="auto"/>
               <w:jc w:val="center"/>
               <w:rPr>
                 <w:rFonts w:ascii="Gadugi" w:eastAsia="Times New Roman" w:hAnsi="Gadugi" w:cs="Calibri"/>
@@ -2756,7 +2764,7 @@
             <w:pPr>
               <w:widowControl/>
               <w:suppressAutoHyphens w:val="0"/>
-              <w:spacing w:line="204" w:lineRule="auto"/>
+              <w:spacing w:line="276" w:lineRule="auto"/>
               <w:jc w:val="center"/>
               <w:rPr>
                 <w:rFonts w:ascii="Gadugi" w:hAnsi="Gadugi"/>
@@ -2784,7 +2792,7 @@
             <w:pPr>
               <w:widowControl/>
               <w:suppressAutoHyphens w:val="0"/>
-              <w:spacing w:line="204" w:lineRule="auto"/>
+              <w:spacing w:line="276" w:lineRule="auto"/>
               <w:jc w:val="center"/>
               <w:rPr>
                 <w:rFonts w:ascii="Gadugi" w:hAnsi="Gadugi"/>
@@ -2819,7 +2827,7 @@
             <w:pPr>
               <w:widowControl/>
               <w:suppressAutoHyphens w:val="0"/>
-              <w:spacing w:line="204" w:lineRule="auto"/>
+              <w:spacing w:line="276" w:lineRule="auto"/>
               <w:jc w:val="center"/>
               <w:rPr>
                 <w:rFonts w:ascii="Gadugi" w:eastAsia="Times New Roman" w:hAnsi="Gadugi" w:cs="Calibri"/>
@@ -2849,7 +2857,7 @@
             <w:pPr>
               <w:widowControl/>
               <w:suppressAutoHyphens w:val="0"/>
-              <w:spacing w:line="204" w:lineRule="auto"/>
+              <w:spacing w:line="276" w:lineRule="auto"/>
               <w:jc w:val="center"/>
               <w:rPr>
                 <w:rFonts w:ascii="Gadugi" w:hAnsi="Gadugi"/>
@@ -2877,7 +2885,7 @@
             <w:pPr>
               <w:widowControl/>
               <w:suppressAutoHyphens w:val="0"/>
-              <w:spacing w:line="204" w:lineRule="auto"/>
+              <w:spacing w:line="276" w:lineRule="auto"/>
               <w:jc w:val="center"/>
               <w:rPr>
                 <w:rFonts w:ascii="Gadugi" w:hAnsi="Gadugi"/>
@@ -2912,7 +2920,7 @@
             <w:pPr>
               <w:widowControl/>
               <w:suppressAutoHyphens w:val="0"/>
-              <w:spacing w:line="204" w:lineRule="auto"/>
+              <w:spacing w:line="276" w:lineRule="auto"/>
               <w:jc w:val="center"/>
               <w:rPr>
                 <w:rFonts w:ascii="Gadugi" w:eastAsia="Times New Roman" w:hAnsi="Gadugi" w:cs="Calibri"/>
@@ -2942,7 +2950,7 @@
             <w:pPr>
               <w:widowControl/>
               <w:suppressAutoHyphens w:val="0"/>
-              <w:spacing w:line="204" w:lineRule="auto"/>
+              <w:spacing w:line="276" w:lineRule="auto"/>
               <w:jc w:val="center"/>
               <w:rPr>
                 <w:rFonts w:ascii="Gadugi" w:hAnsi="Gadugi"/>
@@ -2970,7 +2978,7 @@
             <w:pPr>
               <w:widowControl/>
               <w:suppressAutoHyphens w:val="0"/>
-              <w:spacing w:line="204" w:lineRule="auto"/>
+              <w:spacing w:line="276" w:lineRule="auto"/>
               <w:jc w:val="center"/>
               <w:rPr>
                 <w:rFonts w:ascii="Gadugi" w:hAnsi="Gadugi"/>
@@ -3005,7 +3013,7 @@
             <w:pPr>
               <w:widowControl/>
               <w:suppressAutoHyphens w:val="0"/>
-              <w:spacing w:line="204" w:lineRule="auto"/>
+              <w:spacing w:line="276" w:lineRule="auto"/>
               <w:jc w:val="center"/>
               <w:rPr>
                 <w:rFonts w:ascii="Gadugi" w:eastAsia="Times New Roman" w:hAnsi="Gadugi" w:cs="Calibri"/>
@@ -3035,7 +3043,7 @@
             <w:pPr>
               <w:widowControl/>
               <w:suppressAutoHyphens w:val="0"/>
-              <w:spacing w:line="204" w:lineRule="auto"/>
+              <w:spacing w:line="276" w:lineRule="auto"/>
               <w:jc w:val="center"/>
               <w:rPr>
                 <w:rFonts w:ascii="Gadugi" w:hAnsi="Gadugi"/>
@@ -3063,7 +3071,7 @@
             <w:pPr>
               <w:widowControl/>
               <w:suppressAutoHyphens w:val="0"/>
-              <w:spacing w:line="204" w:lineRule="auto"/>
+              <w:spacing w:line="276" w:lineRule="auto"/>
               <w:jc w:val="center"/>
               <w:rPr>
                 <w:rFonts w:ascii="Gadugi" w:hAnsi="Gadugi"/>
@@ -3098,7 +3106,7 @@
             <w:pPr>
               <w:widowControl/>
               <w:suppressAutoHyphens w:val="0"/>
-              <w:spacing w:line="204" w:lineRule="auto"/>
+              <w:spacing w:line="276" w:lineRule="auto"/>
               <w:jc w:val="center"/>
               <w:rPr>
                 <w:rFonts w:ascii="Gadugi" w:eastAsia="Times New Roman" w:hAnsi="Gadugi" w:cs="Calibri"/>
@@ -3128,7 +3136,7 @@
             <w:pPr>
               <w:widowControl/>
               <w:suppressAutoHyphens w:val="0"/>
-              <w:spacing w:line="204" w:lineRule="auto"/>
+              <w:spacing w:line="276" w:lineRule="auto"/>
               <w:jc w:val="center"/>
               <w:rPr>
                 <w:rFonts w:ascii="Gadugi" w:hAnsi="Gadugi"/>
@@ -3156,7 +3164,7 @@
             <w:pPr>
               <w:widowControl/>
               <w:suppressAutoHyphens w:val="0"/>
-              <w:spacing w:line="204" w:lineRule="auto"/>
+              <w:spacing w:line="276" w:lineRule="auto"/>
               <w:jc w:val="center"/>
               <w:rPr>
                 <w:rFonts w:ascii="Gadugi" w:hAnsi="Gadugi"/>
@@ -3191,7 +3199,7 @@
             <w:pPr>
               <w:widowControl/>
               <w:suppressAutoHyphens w:val="0"/>
-              <w:spacing w:line="204" w:lineRule="auto"/>
+              <w:spacing w:line="276" w:lineRule="auto"/>
               <w:jc w:val="center"/>
               <w:rPr>
                 <w:rFonts w:ascii="Gadugi" w:eastAsia="Times New Roman" w:hAnsi="Gadugi" w:cs="Calibri"/>
@@ -3221,7 +3229,7 @@
             <w:pPr>
               <w:widowControl/>
               <w:suppressAutoHyphens w:val="0"/>
-              <w:spacing w:line="204" w:lineRule="auto"/>
+              <w:spacing w:line="276" w:lineRule="auto"/>
               <w:jc w:val="center"/>
               <w:rPr>
                 <w:rFonts w:ascii="Gadugi" w:hAnsi="Gadugi"/>
@@ -3249,7 +3257,7 @@
             <w:pPr>
               <w:widowControl/>
               <w:suppressAutoHyphens w:val="0"/>
-              <w:spacing w:line="204" w:lineRule="auto"/>
+              <w:spacing w:line="276" w:lineRule="auto"/>
               <w:jc w:val="center"/>
               <w:rPr>
                 <w:rFonts w:ascii="Gadugi" w:hAnsi="Gadugi"/>
@@ -3284,7 +3292,7 @@
             <w:pPr>
               <w:widowControl/>
               <w:suppressAutoHyphens w:val="0"/>
-              <w:spacing w:line="204" w:lineRule="auto"/>
+              <w:spacing w:line="276" w:lineRule="auto"/>
               <w:jc w:val="center"/>
               <w:rPr>
                 <w:rFonts w:ascii="Gadugi" w:eastAsia="Times New Roman" w:hAnsi="Gadugi" w:cs="Calibri"/>
@@ -3314,7 +3322,7 @@
             <w:pPr>
               <w:widowControl/>
               <w:suppressAutoHyphens w:val="0"/>
-              <w:spacing w:line="204" w:lineRule="auto"/>
+              <w:spacing w:line="276" w:lineRule="auto"/>
               <w:jc w:val="center"/>
               <w:rPr>
                 <w:rFonts w:ascii="Gadugi" w:hAnsi="Gadugi"/>
@@ -3342,7 +3350,7 @@
             <w:pPr>
               <w:widowControl/>
               <w:suppressAutoHyphens w:val="0"/>
-              <w:spacing w:line="204" w:lineRule="auto"/>
+              <w:spacing w:line="276" w:lineRule="auto"/>
               <w:jc w:val="center"/>
               <w:rPr>
                 <w:rFonts w:ascii="Gadugi" w:hAnsi="Gadugi"/>
@@ -3377,7 +3385,7 @@
             <w:pPr>
               <w:widowControl/>
               <w:suppressAutoHyphens w:val="0"/>
-              <w:spacing w:line="204" w:lineRule="auto"/>
+              <w:spacing w:line="276" w:lineRule="auto"/>
               <w:jc w:val="center"/>
               <w:rPr>
                 <w:rFonts w:ascii="Gadugi" w:eastAsia="Times New Roman" w:hAnsi="Gadugi" w:cs="Calibri"/>
@@ -3407,7 +3415,7 @@
             <w:pPr>
               <w:widowControl/>
               <w:suppressAutoHyphens w:val="0"/>
-              <w:spacing w:line="204" w:lineRule="auto"/>
+              <w:spacing w:line="276" w:lineRule="auto"/>
               <w:jc w:val="center"/>
               <w:rPr>
                 <w:rFonts w:ascii="Gadugi" w:hAnsi="Gadugi"/>
@@ -3435,7 +3443,7 @@
             <w:pPr>
               <w:widowControl/>
               <w:suppressAutoHyphens w:val="0"/>
-              <w:spacing w:line="204" w:lineRule="auto"/>
+              <w:spacing w:line="276" w:lineRule="auto"/>
               <w:jc w:val="center"/>
               <w:rPr>
                 <w:rFonts w:ascii="Gadugi" w:hAnsi="Gadugi"/>
@@ -3469,7 +3477,7 @@
             <w:pPr>
               <w:widowControl/>
               <w:suppressAutoHyphens w:val="0"/>
-              <w:spacing w:line="204" w:lineRule="auto"/>
+              <w:spacing w:line="276" w:lineRule="auto"/>
               <w:jc w:val="center"/>
               <w:rPr>
                 <w:rFonts w:ascii="Gadugi" w:hAnsi="Gadugi"/>
@@ -3496,7 +3504,7 @@
             <w:pPr>
               <w:widowControl/>
               <w:suppressAutoHyphens w:val="0"/>
-              <w:spacing w:line="204" w:lineRule="auto"/>
+              <w:spacing w:line="276" w:lineRule="auto"/>
               <w:jc w:val="center"/>
               <w:rPr>
                 <w:rFonts w:ascii="Gadugi" w:hAnsi="Gadugi"/>
@@ -3523,7 +3531,7 @@
             <w:pPr>
               <w:widowControl/>
               <w:suppressAutoHyphens w:val="0"/>
-              <w:spacing w:line="204" w:lineRule="auto"/>
+              <w:spacing w:line="276" w:lineRule="auto"/>
               <w:jc w:val="center"/>
               <w:rPr>
                 <w:rFonts w:ascii="Gadugi" w:hAnsi="Gadugi"/>
@@ -3557,7 +3565,7 @@
             <w:pPr>
               <w:widowControl/>
               <w:suppressAutoHyphens w:val="0"/>
-              <w:spacing w:line="204" w:lineRule="auto"/>
+              <w:spacing w:line="276" w:lineRule="auto"/>
               <w:jc w:val="center"/>
               <w:rPr>
                 <w:rFonts w:ascii="Gadugi" w:hAnsi="Gadugi"/>
@@ -3584,7 +3592,7 @@
             <w:pPr>
               <w:widowControl/>
               <w:suppressAutoHyphens w:val="0"/>
-              <w:spacing w:line="204" w:lineRule="auto"/>
+              <w:spacing w:line="276" w:lineRule="auto"/>
               <w:jc w:val="center"/>
               <w:rPr>
                 <w:rFonts w:ascii="Gadugi" w:hAnsi="Gadugi"/>
@@ -3611,7 +3619,7 @@
             <w:pPr>
               <w:widowControl/>
               <w:suppressAutoHyphens w:val="0"/>
-              <w:spacing w:line="204" w:lineRule="auto"/>
+              <w:spacing w:line="276" w:lineRule="auto"/>
               <w:jc w:val="center"/>
               <w:rPr>
                 <w:rFonts w:ascii="Gadugi" w:hAnsi="Gadugi"/>
@@ -3645,7 +3653,7 @@
             <w:pPr>
               <w:widowControl/>
               <w:suppressAutoHyphens w:val="0"/>
-              <w:spacing w:line="204" w:lineRule="auto"/>
+              <w:spacing w:line="276" w:lineRule="auto"/>
               <w:jc w:val="center"/>
               <w:rPr>
                 <w:rFonts w:ascii="Gadugi" w:hAnsi="Gadugi"/>
@@ -3672,7 +3680,7 @@
             <w:pPr>
               <w:widowControl/>
               <w:suppressAutoHyphens w:val="0"/>
-              <w:spacing w:line="204" w:lineRule="auto"/>
+              <w:spacing w:line="276" w:lineRule="auto"/>
               <w:jc w:val="center"/>
               <w:rPr>
                 <w:rFonts w:ascii="Gadugi" w:hAnsi="Gadugi"/>
@@ -3699,7 +3707,7 @@
             <w:pPr>
               <w:widowControl/>
               <w:suppressAutoHyphens w:val="0"/>
-              <w:spacing w:line="204" w:lineRule="auto"/>
+              <w:spacing w:line="276" w:lineRule="auto"/>
               <w:jc w:val="center"/>
               <w:rPr>
                 <w:rFonts w:ascii="Gadugi" w:hAnsi="Gadugi"/>
@@ -3733,7 +3741,7 @@
             <w:pPr>
               <w:widowControl/>
               <w:suppressAutoHyphens w:val="0"/>
-              <w:spacing w:line="204" w:lineRule="auto"/>
+              <w:spacing w:line="276" w:lineRule="auto"/>
               <w:jc w:val="center"/>
               <w:rPr>
                 <w:rFonts w:ascii="Gadugi" w:hAnsi="Gadugi"/>
@@ -3760,7 +3768,7 @@
             <w:pPr>
               <w:widowControl/>
               <w:suppressAutoHyphens w:val="0"/>
-              <w:spacing w:line="204" w:lineRule="auto"/>
+              <w:spacing w:line="276" w:lineRule="auto"/>
               <w:jc w:val="center"/>
               <w:rPr>
                 <w:rFonts w:ascii="Gadugi" w:hAnsi="Gadugi"/>
@@ -3787,7 +3795,7 @@
             <w:pPr>
               <w:widowControl/>
               <w:suppressAutoHyphens w:val="0"/>
-              <w:spacing w:line="204" w:lineRule="auto"/>
+              <w:spacing w:line="276" w:lineRule="auto"/>
               <w:jc w:val="center"/>
               <w:rPr>
                 <w:rFonts w:ascii="Gadugi" w:hAnsi="Gadugi"/>
@@ -3821,7 +3829,7 @@
             <w:pPr>
               <w:widowControl/>
               <w:suppressAutoHyphens w:val="0"/>
-              <w:spacing w:line="204" w:lineRule="auto"/>
+              <w:spacing w:line="276" w:lineRule="auto"/>
               <w:jc w:val="center"/>
               <w:rPr>
                 <w:rFonts w:ascii="Gadugi" w:hAnsi="Gadugi"/>
@@ -3848,7 +3856,7 @@
             <w:pPr>
               <w:widowControl/>
               <w:suppressAutoHyphens w:val="0"/>
-              <w:spacing w:line="204" w:lineRule="auto"/>
+              <w:spacing w:line="276" w:lineRule="auto"/>
               <w:jc w:val="center"/>
               <w:rPr>
                 <w:rFonts w:ascii="Gadugi" w:hAnsi="Gadugi"/>
@@ -3875,7 +3883,7 @@
             <w:pPr>
               <w:widowControl/>
               <w:suppressAutoHyphens w:val="0"/>
-              <w:spacing w:line="204" w:lineRule="auto"/>
+              <w:spacing w:line="276" w:lineRule="auto"/>
               <w:jc w:val="center"/>
               <w:rPr>
                 <w:rFonts w:ascii="Gadugi" w:hAnsi="Gadugi"/>
@@ -3910,7 +3918,7 @@
             <w:pPr>
               <w:widowControl/>
               <w:suppressAutoHyphens w:val="0"/>
-              <w:spacing w:line="204" w:lineRule="auto"/>
+              <w:spacing w:line="276" w:lineRule="auto"/>
               <w:jc w:val="center"/>
               <w:rPr>
                 <w:rFonts w:ascii="Gadugi" w:eastAsia="Times New Roman" w:hAnsi="Gadugi" w:cs="Calibri"/>
@@ -3946,7 +3954,7 @@
             <w:pPr>
               <w:widowControl/>
               <w:suppressAutoHyphens w:val="0"/>
-              <w:spacing w:line="204" w:lineRule="auto"/>
+              <w:spacing w:line="276" w:lineRule="auto"/>
               <w:jc w:val="center"/>
               <w:rPr>
                 <w:rFonts w:ascii="Gadugi" w:eastAsia="Times New Roman" w:hAnsi="Gadugi" w:cs="Calibri"/>
@@ -3977,7 +3985,7 @@
     <w:p>
       <w:pPr>
         <w:pStyle w:val="NormalWeb"/>
-        <w:spacing w:before="0" w:beforeAutospacing="0" w:after="0" w:afterAutospacing="0" w:line="204" w:lineRule="auto"/>
+        <w:spacing w:before="0" w:beforeAutospacing="0" w:after="0" w:afterAutospacing="0" w:line="276" w:lineRule="auto"/>
         <w:jc w:val="both"/>
         <w:rPr>
           <w:rFonts w:ascii="Gadugi" w:hAnsi="Gadugi"/>
@@ -3998,7 +4006,7 @@
       <w:pPr>
         <w:widowControl/>
         <w:suppressAutoHyphens w:val="0"/>
-        <w:spacing w:line="204" w:lineRule="auto"/>
+        <w:spacing w:line="276" w:lineRule="auto"/>
         <w:jc w:val="both"/>
         <w:outlineLvl w:val="2"/>
         <w:rPr>
@@ -4045,7 +4053,7 @@
       <w:pPr>
         <w:widowControl/>
         <w:suppressAutoHyphens w:val="0"/>
-        <w:spacing w:line="204" w:lineRule="auto"/>
+        <w:spacing w:line="276" w:lineRule="auto"/>
         <w:jc w:val="both"/>
         <w:rPr>
           <w:rFonts w:ascii="Gadugi" w:eastAsia="Times New Roman" w:hAnsi="Gadugi" w:cs="Times New Roman"/>
@@ -4098,7 +4106,7 @@
       <w:pPr>
         <w:widowControl/>
         <w:suppressAutoHyphens w:val="0"/>
-        <w:spacing w:line="204" w:lineRule="auto"/>
+        <w:spacing w:line="276" w:lineRule="auto"/>
         <w:jc w:val="both"/>
         <w:rPr>
           <w:rFonts w:ascii="Gadugi" w:eastAsia="Times New Roman" w:hAnsi="Gadugi" w:cs="Times New Roman"/>
@@ -4125,7 +4133,7 @@
       <w:pPr>
         <w:widowControl/>
         <w:suppressAutoHyphens w:val="0"/>
-        <w:spacing w:line="204" w:lineRule="auto"/>
+        <w:spacing w:line="276" w:lineRule="auto"/>
         <w:jc w:val="both"/>
         <w:rPr>
           <w:rFonts w:ascii="Gadugi" w:eastAsia="Times New Roman" w:hAnsi="Gadugi" w:cs="Times New Roman"/>
@@ -4152,7 +4160,7 @@
       <w:pPr>
         <w:widowControl/>
         <w:suppressAutoHyphens w:val="0"/>
-        <w:spacing w:line="204" w:lineRule="auto"/>
+        <w:spacing w:line="276" w:lineRule="auto"/>
         <w:jc w:val="both"/>
         <w:outlineLvl w:val="2"/>
         <w:rPr>
@@ -4199,7 +4207,7 @@
       <w:pPr>
         <w:widowControl/>
         <w:suppressAutoHyphens w:val="0"/>
-        <w:spacing w:line="204" w:lineRule="auto"/>
+        <w:spacing w:line="276" w:lineRule="auto"/>
         <w:jc w:val="both"/>
         <w:rPr>
           <w:rFonts w:ascii="Gadugi" w:eastAsia="Times New Roman" w:hAnsi="Gadugi" w:cs="Times New Roman"/>
@@ -4219,6 +4227,7 @@
           <w:szCs w:val="20"/>
           <w:lang w:val="es-PE" w:eastAsia="es-PE" w:bidi="ar-SA"/>
         </w:rPr>
+        <w:lastRenderedPageBreak/>
         <w:t xml:space="preserve">LA PROMITENTE VENDEDORA DEJA CONSTANCIA QUE EL PROYECTO DENOMINADO </w:t>
       </w:r>
       <w:r>
@@ -4274,7 +4283,7 @@
       <w:pPr>
         <w:widowControl/>
         <w:suppressAutoHyphens w:val="0"/>
-        <w:spacing w:line="204" w:lineRule="auto"/>
+        <w:spacing w:line="276" w:lineRule="auto"/>
         <w:jc w:val="both"/>
         <w:rPr>
           <w:rFonts w:ascii="Gadugi" w:eastAsia="Times New Roman" w:hAnsi="Gadugi" w:cs="Times New Roman"/>
@@ -4301,7 +4310,7 @@
       <w:pPr>
         <w:widowControl/>
         <w:suppressAutoHyphens w:val="0"/>
-        <w:spacing w:line="204" w:lineRule="auto"/>
+        <w:spacing w:line="276" w:lineRule="auto"/>
         <w:jc w:val="both"/>
         <w:outlineLvl w:val="2"/>
         <w:rPr>
@@ -4348,7 +4357,7 @@
       <w:pPr>
         <w:widowControl/>
         <w:suppressAutoHyphens w:val="0"/>
-        <w:spacing w:line="204" w:lineRule="auto"/>
+        <w:spacing w:line="276" w:lineRule="auto"/>
         <w:jc w:val="both"/>
         <w:rPr>
           <w:rFonts w:ascii="Gadugi" w:eastAsia="Times New Roman" w:hAnsi="Gadugi" w:cs="Times New Roman"/>
@@ -4375,7 +4384,7 @@
       <w:pPr>
         <w:widowControl/>
         <w:suppressAutoHyphens w:val="0"/>
-        <w:spacing w:line="204" w:lineRule="auto"/>
+        <w:spacing w:line="276" w:lineRule="auto"/>
         <w:jc w:val="both"/>
         <w:rPr>
           <w:rFonts w:ascii="Gadugi" w:eastAsia="Times New Roman" w:hAnsi="Gadugi" w:cs="Times New Roman"/>
@@ -4402,7 +4411,7 @@
       <w:pPr>
         <w:widowControl/>
         <w:suppressAutoHyphens w:val="0"/>
-        <w:spacing w:line="204" w:lineRule="auto"/>
+        <w:spacing w:line="276" w:lineRule="auto"/>
         <w:jc w:val="both"/>
         <w:outlineLvl w:val="2"/>
         <w:rPr>
@@ -4449,7 +4458,7 @@
       <w:pPr>
         <w:widowControl/>
         <w:suppressAutoHyphens w:val="0"/>
-        <w:spacing w:line="204" w:lineRule="auto"/>
+        <w:spacing w:line="276" w:lineRule="auto"/>
         <w:jc w:val="both"/>
         <w:rPr>
           <w:rFonts w:ascii="Gadugi" w:eastAsia="Times New Roman" w:hAnsi="Gadugi" w:cs="Times New Roman"/>
@@ -4489,7 +4498,7 @@
       <w:pPr>
         <w:widowControl/>
         <w:suppressAutoHyphens w:val="0"/>
-        <w:spacing w:line="204" w:lineRule="auto"/>
+        <w:spacing w:line="276" w:lineRule="auto"/>
         <w:jc w:val="both"/>
         <w:rPr>
           <w:rFonts w:ascii="Gadugi" w:eastAsia="Times New Roman" w:hAnsi="Gadugi" w:cs="Times New Roman"/>
@@ -4540,7 +4549,7 @@
       <w:pPr>
         <w:widowControl/>
         <w:suppressAutoHyphens w:val="0"/>
-        <w:spacing w:line="204" w:lineRule="auto"/>
+        <w:spacing w:line="276" w:lineRule="auto"/>
         <w:jc w:val="both"/>
         <w:rPr>
           <w:rFonts w:ascii="Gadugi" w:eastAsia="Times New Roman" w:hAnsi="Gadugi" w:cs="Times New Roman"/>
@@ -4560,7 +4569,6 @@
           <w:szCs w:val="20"/>
           <w:lang w:val="es-PE" w:eastAsia="es-PE" w:bidi="ar-SA"/>
         </w:rPr>
-        <w:lastRenderedPageBreak/>
         <w:t xml:space="preserve">LAS PARTES DEJAN CONSTANCIA QUE CUALQUIER OBRA ADICIONAL, MEJORA, CONSTRUCCIÓN O GESTIÓN DISTINTA A LAS ANTES SEÑALADAS SERÁ ASUMIDA EXCLUSIVAMENTE POR </w:t>
       </w:r>
       <w:r>
@@ -4574,7 +4582,7 @@
           <w:szCs w:val="20"/>
           <w:lang w:val="es-PE" w:eastAsia="es-PE" w:bidi="ar-SA"/>
         </w:rPr>
-        <w:t>LOS PROMITENTES COMPRADORES</w:t>
+        <w:t>«P_COMPRADOR»</w:t>
       </w:r>
       <w:r>
         <w:rPr>
@@ -4592,7 +4600,7 @@
       <w:pPr>
         <w:widowControl/>
         <w:suppressAutoHyphens w:val="0"/>
-        <w:spacing w:line="204" w:lineRule="auto"/>
+        <w:spacing w:line="276" w:lineRule="auto"/>
         <w:jc w:val="both"/>
         <w:outlineLvl w:val="2"/>
         <w:rPr>
@@ -4639,7 +4647,7 @@
       <w:pPr>
         <w:widowControl/>
         <w:suppressAutoHyphens w:val="0"/>
-        <w:spacing w:line="204" w:lineRule="auto"/>
+        <w:spacing w:line="276" w:lineRule="auto"/>
         <w:jc w:val="both"/>
         <w:rPr>
           <w:rFonts w:ascii="Gadugi" w:eastAsia="Times New Roman" w:hAnsi="Gadugi" w:cs="Times New Roman"/>
@@ -4694,7 +4702,7 @@
           <w:numId w:val="8"/>
         </w:numPr>
         <w:suppressAutoHyphens w:val="0"/>
-        <w:spacing w:line="204" w:lineRule="auto"/>
+        <w:spacing w:line="276" w:lineRule="auto"/>
         <w:jc w:val="both"/>
         <w:rPr>
           <w:rFonts w:ascii="Gadugi" w:eastAsia="Times New Roman" w:hAnsi="Gadugi" w:cs="Times New Roman"/>
@@ -4714,7 +4722,40 @@
           <w:szCs w:val="20"/>
           <w:lang w:val="es-PE" w:eastAsia="es-PE" w:bidi="ar-SA"/>
         </w:rPr>
-        <w:t xml:space="preserve">DEVOLVER A LOS PROMITENTES COMPRADORES LA TOTALIDAD DEL MONTO RECIBIDO; Y, </w:t>
+        <w:t xml:space="preserve">DEVOLVER A </w:t>
+      </w:r>
+      <w:r>
+        <w:rPr>
+          <w:rFonts w:ascii="Gadugi" w:eastAsia="Times New Roman" w:hAnsi="Gadugi" w:cs="Times New Roman"/>
+          <w:color w:val="auto"/>
+          <w:kern w:val="0"/>
+          <w:sz w:val="20"/>
+          <w:szCs w:val="20"/>
+          <w:lang w:val="es-PE" w:eastAsia="es-PE" w:bidi="ar-SA"/>
+        </w:rPr>
+        <w:t>«P_COMPRADOR»</w:t>
+      </w:r>
+      <w:r>
+        <w:rPr>
+          <w:rFonts w:ascii="Gadugi" w:eastAsia="Times New Roman" w:hAnsi="Gadugi" w:cs="Times New Roman"/>
+          <w:color w:val="auto"/>
+          <w:kern w:val="0"/>
+          <w:sz w:val="20"/>
+          <w:szCs w:val="20"/>
+          <w:lang w:val="es-PE" w:eastAsia="es-PE" w:bidi="ar-SA"/>
+        </w:rPr>
+        <w:t xml:space="preserve"> </w:t>
+      </w:r>
+      <w:r>
+        <w:rPr>
+          <w:rFonts w:ascii="Gadugi" w:eastAsia="Times New Roman" w:hAnsi="Gadugi" w:cs="Times New Roman"/>
+          <w:color w:val="auto"/>
+          <w:kern w:val="0"/>
+          <w:sz w:val="20"/>
+          <w:szCs w:val="20"/>
+          <w:lang w:val="es-PE" w:eastAsia="es-PE" w:bidi="ar-SA"/>
+        </w:rPr>
+        <w:t xml:space="preserve">LA TOTALIDAD DEL MONTO RECIBIDO; Y, </w:t>
       </w:r>
     </w:p>
     <w:p>
@@ -4725,7 +4766,7 @@
           <w:numId w:val="8"/>
         </w:numPr>
         <w:suppressAutoHyphens w:val="0"/>
-        <w:spacing w:line="204" w:lineRule="auto"/>
+        <w:spacing w:line="276" w:lineRule="auto"/>
         <w:jc w:val="both"/>
         <w:rPr>
           <w:rFonts w:ascii="Gadugi" w:eastAsia="Times New Roman" w:hAnsi="Gadugi" w:cs="Times New Roman"/>
@@ -4752,7 +4793,7 @@
       <w:pPr>
         <w:widowControl/>
         <w:suppressAutoHyphens w:val="0"/>
-        <w:spacing w:line="204" w:lineRule="auto"/>
+        <w:spacing w:line="276" w:lineRule="auto"/>
         <w:jc w:val="both"/>
         <w:rPr>
           <w:rFonts w:ascii="Gadugi" w:eastAsia="Times New Roman" w:hAnsi="Gadugi" w:cs="Times New Roman"/>
@@ -4785,18 +4826,31 @@
           <w:szCs w:val="20"/>
           <w:lang w:val="es-PE" w:eastAsia="es-PE" w:bidi="ar-SA"/>
         </w:rPr>
-        <w:t>LOS PROMITENTES COMPRADORES</w:t>
-      </w:r>
-      <w:r>
-        <w:rPr>
-          <w:rFonts w:ascii="Gadugi" w:eastAsia="Times New Roman" w:hAnsi="Gadugi" w:cs="Times New Roman"/>
-          <w:color w:val="auto"/>
-          <w:kern w:val="0"/>
-          <w:sz w:val="20"/>
-          <w:szCs w:val="20"/>
-          <w:lang w:val="es-PE" w:eastAsia="es-PE" w:bidi="ar-SA"/>
-        </w:rPr>
-        <w:t xml:space="preserve"> DESISTIERAN INJUSTIFICADAMENTE DE CELEBRAR LA COMPRAVENTA DEFINITIVA O INCUMPLIERAN CON SUS OBLIGACIONES ESENCIALES LUEGO DE SER REQUERIDOS POR ESCRITO, </w:t>
+        <w:t>«P_COMPRADOR»</w:t>
+      </w:r>
+      <w:r>
+        <w:rPr>
+          <w:rFonts w:ascii="Gadugi" w:eastAsia="Times New Roman" w:hAnsi="Gadugi" w:cs="Times New Roman"/>
+          <w:b/>
+          <w:bCs/>
+          <w:color w:val="auto"/>
+          <w:kern w:val="0"/>
+          <w:sz w:val="20"/>
+          <w:szCs w:val="20"/>
+          <w:lang w:val="es-PE" w:eastAsia="es-PE" w:bidi="ar-SA"/>
+        </w:rPr>
+        <w:t xml:space="preserve"> </w:t>
+      </w:r>
+      <w:r>
+        <w:rPr>
+          <w:rFonts w:ascii="Gadugi" w:eastAsia="Times New Roman" w:hAnsi="Gadugi" w:cs="Times New Roman"/>
+          <w:color w:val="auto"/>
+          <w:kern w:val="0"/>
+          <w:sz w:val="20"/>
+          <w:szCs w:val="20"/>
+          <w:lang w:val="es-PE" w:eastAsia="es-PE" w:bidi="ar-SA"/>
+        </w:rPr>
+        <w:t xml:space="preserve">DESISTIERAN INJUSTIFICADAMENTE DE CELEBRAR LA COMPRAVENTA DEFINITIVA O INCUMPLIERAN CON SUS OBLIGACIONES ESENCIALES LUEGO DE SER REQUERIDOS POR ESCRITO, </w:t>
       </w:r>
       <w:r>
         <w:rPr>
@@ -4827,7 +4881,7 @@
       <w:pPr>
         <w:widowControl/>
         <w:suppressAutoHyphens w:val="0"/>
-        <w:spacing w:line="204" w:lineRule="auto"/>
+        <w:spacing w:line="276" w:lineRule="auto"/>
         <w:jc w:val="both"/>
         <w:outlineLvl w:val="2"/>
         <w:rPr>
@@ -4874,7 +4928,7 @@
       <w:pPr>
         <w:widowControl/>
         <w:suppressAutoHyphens w:val="0"/>
-        <w:spacing w:line="204" w:lineRule="auto"/>
+        <w:spacing w:line="276" w:lineRule="auto"/>
         <w:jc w:val="both"/>
         <w:rPr>
           <w:rFonts w:ascii="Gadugi" w:eastAsia="Times New Roman" w:hAnsi="Gadugi" w:cs="Times New Roman"/>
@@ -4901,7 +4955,7 @@
       <w:pPr>
         <w:widowControl/>
         <w:suppressAutoHyphens w:val="0"/>
-        <w:spacing w:line="204" w:lineRule="auto"/>
+        <w:spacing w:line="276" w:lineRule="auto"/>
         <w:jc w:val="both"/>
         <w:outlineLvl w:val="2"/>
         <w:rPr>
@@ -4927,6 +4981,7 @@
           <w:szCs w:val="20"/>
           <w:lang w:val="es-PE" w:eastAsia="es-PE" w:bidi="ar-SA"/>
         </w:rPr>
+        <w:lastRenderedPageBreak/>
         <w:t>DÉCIMA.-</w:t>
       </w:r>
       <w:proofErr w:type="gramEnd"/>
@@ -4948,7 +5003,7 @@
       <w:pPr>
         <w:widowControl/>
         <w:suppressAutoHyphens w:val="0"/>
-        <w:spacing w:line="204" w:lineRule="auto"/>
+        <w:spacing w:line="276" w:lineRule="auto"/>
         <w:jc w:val="both"/>
         <w:rPr>
           <w:rFonts w:ascii="Gadugi" w:eastAsia="Times New Roman" w:hAnsi="Gadugi" w:cs="Times New Roman"/>
@@ -4968,14 +5023,36 @@
           <w:szCs w:val="20"/>
           <w:lang w:val="es-PE" w:eastAsia="es-PE" w:bidi="ar-SA"/>
         </w:rPr>
-        <w:t>TODOS LOS GASTOS NOTARIALES, REGISTRALES, TRIBUTOS Y DEMÁS CONCEPTOS QUE ORIGINE LA ELEVACIÓN A ESCRITURA PÚBLICA E INSCRIPCIÓN DE LA COMPRAVENTA DEFINITIVA SERÁN ASUMIDOS ÍNTEGRAMENTE POR LOS PROMITENTES COMPRADORES, SALVO AQUELLOS TRIBUTOS QUE POR MANDATO LEGAL CORRESPONDAN EXCLUSIVAMENTE AL VENDEDOR.</w:t>
+        <w:t xml:space="preserve">TODOS LOS GASTOS NOTARIALES, REGISTRALES, TRIBUTOS Y DEMÁS CONCEPTOS QUE ORIGINE LA ELEVACIÓN A ESCRITURA PÚBLICA E INSCRIPCIÓN DE LA COMPRAVENTA DEFINITIVA SERÁN ASUMIDOS ÍNTEGRAMENTE POR </w:t>
+      </w:r>
+      <w:r>
+        <w:rPr>
+          <w:rFonts w:ascii="Gadugi" w:eastAsia="Times New Roman" w:hAnsi="Gadugi" w:cs="Times New Roman"/>
+          <w:color w:val="auto"/>
+          <w:kern w:val="0"/>
+          <w:sz w:val="20"/>
+          <w:szCs w:val="20"/>
+          <w:lang w:val="es-PE" w:eastAsia="es-PE" w:bidi="ar-SA"/>
+        </w:rPr>
+        <w:t>«P_COMPRADOR»</w:t>
+      </w:r>
+      <w:r>
+        <w:rPr>
+          <w:rFonts w:ascii="Gadugi" w:eastAsia="Times New Roman" w:hAnsi="Gadugi" w:cs="Times New Roman"/>
+          <w:color w:val="auto"/>
+          <w:kern w:val="0"/>
+          <w:sz w:val="20"/>
+          <w:szCs w:val="20"/>
+          <w:lang w:val="es-PE" w:eastAsia="es-PE" w:bidi="ar-SA"/>
+        </w:rPr>
+        <w:t>, SALVO AQUELLOS TRIBUTOS QUE POR MANDATO LEGAL CORRESPONDAN EXCLUSIVAMENTE AL VENDEDOR.</w:t>
       </w:r>
     </w:p>
     <w:p>
       <w:pPr>
         <w:widowControl/>
         <w:suppressAutoHyphens w:val="0"/>
-        <w:spacing w:line="204" w:lineRule="auto"/>
+        <w:spacing w:line="276" w:lineRule="auto"/>
         <w:jc w:val="both"/>
         <w:outlineLvl w:val="2"/>
         <w:rPr>
@@ -5035,7 +5112,7 @@
       <w:pPr>
         <w:widowControl/>
         <w:suppressAutoHyphens w:val="0"/>
-        <w:spacing w:line="204" w:lineRule="auto"/>
+        <w:spacing w:line="276" w:lineRule="auto"/>
         <w:jc w:val="both"/>
         <w:rPr>
           <w:rFonts w:ascii="Gadugi" w:eastAsia="Times New Roman" w:hAnsi="Gadugi" w:cs="Times New Roman"/>
@@ -5062,7 +5139,7 @@
       <w:pPr>
         <w:widowControl/>
         <w:suppressAutoHyphens w:val="0"/>
-        <w:spacing w:line="204" w:lineRule="auto"/>
+        <w:spacing w:line="276" w:lineRule="auto"/>
         <w:jc w:val="both"/>
         <w:rPr>
           <w:rFonts w:ascii="Gadugi" w:eastAsia="Times New Roman" w:hAnsi="Gadugi" w:cs="Times New Roman"/>
@@ -5089,7 +5166,7 @@
       <w:pPr>
         <w:widowControl/>
         <w:suppressAutoHyphens w:val="0"/>
-        <w:spacing w:line="204" w:lineRule="auto"/>
+        <w:spacing w:line="276" w:lineRule="auto"/>
         <w:jc w:val="both"/>
         <w:outlineLvl w:val="2"/>
         <w:rPr>
@@ -5149,7 +5226,7 @@
       <w:pPr>
         <w:widowControl/>
         <w:suppressAutoHyphens w:val="0"/>
-        <w:spacing w:line="204" w:lineRule="auto"/>
+        <w:spacing w:line="276" w:lineRule="auto"/>
         <w:jc w:val="both"/>
         <w:rPr>
           <w:rFonts w:ascii="Gadugi" w:eastAsia="Times New Roman" w:hAnsi="Gadugi" w:cs="Times New Roman"/>
@@ -5176,7 +5253,7 @@
       <w:pPr>
         <w:widowControl/>
         <w:suppressAutoHyphens w:val="0"/>
-        <w:spacing w:after="100" w:afterAutospacing="1" w:line="204" w:lineRule="auto"/>
+        <w:spacing w:after="100" w:afterAutospacing="1" w:line="276" w:lineRule="auto"/>
         <w:jc w:val="both"/>
         <w:rPr>
           <w:rFonts w:ascii="Gadugi" w:eastAsia="Times New Roman" w:hAnsi="Gadugi" w:cs="Times New Roman"/>
@@ -5231,7 +5308,7 @@
       <w:pPr>
         <w:widowControl/>
         <w:suppressAutoHyphens w:val="0"/>
-        <w:spacing w:line="204" w:lineRule="auto"/>
+        <w:spacing w:line="276" w:lineRule="auto"/>
         <w:jc w:val="both"/>
         <w:rPr>
           <w:rFonts w:ascii="Gadugi" w:eastAsia="Times New Roman" w:hAnsi="Gadugi" w:cs="Times New Roman"/>
@@ -5252,7 +5329,7 @@
       <w:pPr>
         <w:widowControl/>
         <w:suppressAutoHyphens w:val="0"/>
-        <w:spacing w:line="204" w:lineRule="auto"/>
+        <w:spacing w:line="276" w:lineRule="auto"/>
         <w:jc w:val="both"/>
         <w:rPr>
           <w:rFonts w:ascii="Gadugi" w:eastAsia="Times New Roman" w:hAnsi="Gadugi" w:cs="Times New Roman"/>
@@ -5268,7 +5345,7 @@
       <w:pPr>
         <w:widowControl/>
         <w:suppressAutoHyphens w:val="0"/>
-        <w:spacing w:line="204" w:lineRule="auto"/>
+        <w:spacing w:line="276" w:lineRule="auto"/>
         <w:jc w:val="both"/>
         <w:rPr>
           <w:rFonts w:ascii="Gadugi" w:eastAsia="Times New Roman" w:hAnsi="Gadugi" w:cs="Times New Roman"/>
@@ -5286,7 +5363,7 @@
       <w:pPr>
         <w:widowControl/>
         <w:suppressAutoHyphens w:val="0"/>
-        <w:spacing w:line="204" w:lineRule="auto"/>
+        <w:spacing w:line="276" w:lineRule="auto"/>
         <w:jc w:val="both"/>
         <w:rPr>
           <w:rFonts w:ascii="Gadugi" w:eastAsia="Times New Roman" w:hAnsi="Gadugi" w:cs="Times New Roman"/>
@@ -5304,7 +5381,7 @@
       <w:pPr>
         <w:widowControl/>
         <w:suppressAutoHyphens w:val="0"/>
-        <w:spacing w:line="204" w:lineRule="auto"/>
+        <w:spacing w:line="276" w:lineRule="auto"/>
         <w:jc w:val="both"/>
         <w:rPr>
           <w:rFonts w:ascii="Gadugi" w:eastAsia="Times New Roman" w:hAnsi="Gadugi" w:cs="Times New Roman"/>
@@ -5322,7 +5399,7 @@
       <w:pPr>
         <w:widowControl/>
         <w:suppressAutoHyphens w:val="0"/>
-        <w:spacing w:line="204" w:lineRule="auto"/>
+        <w:spacing w:line="276" w:lineRule="auto"/>
         <w:jc w:val="both"/>
         <w:rPr>
           <w:rFonts w:ascii="Gadugi" w:eastAsia="Times New Roman" w:hAnsi="Gadugi" w:cs="Times New Roman"/>
@@ -5340,7 +5417,7 @@
       <w:pPr>
         <w:widowControl/>
         <w:suppressAutoHyphens w:val="0"/>
-        <w:spacing w:line="204" w:lineRule="auto"/>
+        <w:spacing w:line="276" w:lineRule="auto"/>
         <w:jc w:val="center"/>
         <w:rPr>
           <w:rFonts w:ascii="Gadugi" w:eastAsia="Times New Roman" w:hAnsi="Gadugi" w:cs="Times New Roman"/>
@@ -5371,7 +5448,7 @@
       <w:pPr>
         <w:widowControl/>
         <w:suppressAutoHyphens w:val="0"/>
-        <w:spacing w:line="204" w:lineRule="auto"/>
+        <w:spacing w:line="276" w:lineRule="auto"/>
         <w:jc w:val="center"/>
         <w:rPr>
           <w:rFonts w:ascii="Gadugi" w:eastAsia="Times New Roman" w:hAnsi="Gadugi" w:cs="Times New Roman"/>
@@ -5402,7 +5479,7 @@
       <w:pPr>
         <w:widowControl/>
         <w:suppressAutoHyphens w:val="0"/>
-        <w:spacing w:line="204" w:lineRule="auto"/>
+        <w:spacing w:line="276" w:lineRule="auto"/>
         <w:jc w:val="center"/>
         <w:rPr>
           <w:rFonts w:ascii="Gadugi" w:eastAsia="Times New Roman" w:hAnsi="Gadugi" w:cs="Times New Roman"/>
@@ -5433,7 +5510,7 @@
       <w:pPr>
         <w:widowControl/>
         <w:suppressAutoHyphens w:val="0"/>
-        <w:spacing w:line="204" w:lineRule="auto"/>
+        <w:spacing w:line="276" w:lineRule="auto"/>
         <w:jc w:val="center"/>
         <w:rPr>
           <w:rFonts w:ascii="Gadugi" w:eastAsia="Times New Roman" w:hAnsi="Gadugi" w:cs="Times New Roman"/>
@@ -5477,7 +5554,7 @@
       <w:pPr>
         <w:widowControl/>
         <w:suppressAutoHyphens w:val="0"/>
-        <w:spacing w:line="204" w:lineRule="auto"/>
+        <w:spacing w:line="276" w:lineRule="auto"/>
         <w:jc w:val="center"/>
         <w:rPr>
           <w:rFonts w:ascii="Gadugi" w:eastAsia="Times New Roman" w:hAnsi="Gadugi" w:cs="Times New Roman"/>
@@ -5493,7 +5570,7 @@
       <w:pPr>
         <w:widowControl/>
         <w:suppressAutoHyphens w:val="0"/>
-        <w:spacing w:line="204" w:lineRule="auto"/>
+        <w:spacing w:line="276" w:lineRule="auto"/>
         <w:jc w:val="center"/>
         <w:rPr>
           <w:rFonts w:ascii="Gadugi" w:eastAsia="Times New Roman" w:hAnsi="Gadugi" w:cs="Times New Roman"/>
@@ -5509,7 +5586,7 @@
       <w:pPr>
         <w:widowControl/>
         <w:suppressAutoHyphens w:val="0"/>
-        <w:spacing w:line="204" w:lineRule="auto"/>
+        <w:spacing w:line="276" w:lineRule="auto"/>
         <w:jc w:val="center"/>
         <w:rPr>
           <w:rFonts w:ascii="Gadugi" w:eastAsia="Times New Roman" w:hAnsi="Gadugi" w:cs="Times New Roman"/>
@@ -5525,7 +5602,7 @@
       <w:pPr>
         <w:widowControl/>
         <w:suppressAutoHyphens w:val="0"/>
-        <w:spacing w:line="204" w:lineRule="auto"/>
+        <w:spacing w:line="276" w:lineRule="auto"/>
         <w:jc w:val="center"/>
         <w:rPr>
           <w:rFonts w:ascii="Gadugi" w:eastAsia="Times New Roman" w:hAnsi="Gadugi" w:cs="Times New Roman"/>
@@ -5541,7 +5618,7 @@
       <w:pPr>
         <w:widowControl/>
         <w:suppressAutoHyphens w:val="0"/>
-        <w:spacing w:line="204" w:lineRule="auto"/>
+        <w:spacing w:line="276" w:lineRule="auto"/>
         <w:jc w:val="center"/>
         <w:rPr>
           <w:rFonts w:ascii="Gadugi" w:eastAsia="Times New Roman" w:hAnsi="Gadugi" w:cs="Times New Roman"/>
@@ -5557,7 +5634,7 @@
       <w:pPr>
         <w:widowControl/>
         <w:suppressAutoHyphens w:val="0"/>
-        <w:spacing w:line="204" w:lineRule="auto"/>
+        <w:spacing w:line="276" w:lineRule="auto"/>
         <w:jc w:val="center"/>
         <w:rPr>
           <w:rFonts w:ascii="Gadugi" w:eastAsia="Times New Roman" w:hAnsi="Gadugi" w:cs="Times New Roman"/>
@@ -5584,7 +5661,7 @@
       <w:pPr>
         <w:widowControl/>
         <w:suppressAutoHyphens w:val="0"/>
-        <w:spacing w:line="204" w:lineRule="auto"/>
+        <w:spacing w:line="276" w:lineRule="auto"/>
         <w:jc w:val="center"/>
         <w:rPr>
           <w:rFonts w:ascii="Gadugi" w:eastAsia="Times New Roman" w:hAnsi="Gadugi" w:cs="Times New Roman"/>
@@ -5615,7 +5692,7 @@
       <w:pPr>
         <w:widowControl/>
         <w:suppressAutoHyphens w:val="0"/>
-        <w:spacing w:line="204" w:lineRule="auto"/>
+        <w:spacing w:line="276" w:lineRule="auto"/>
         <w:rPr>
           <w:rFonts w:ascii="Gadugi" w:eastAsia="Times New Roman" w:hAnsi="Gadugi" w:cs="Times New Roman"/>
           <w:b/>
@@ -5630,7 +5707,7 @@
     </w:p>
     <w:p>
       <w:pPr>
-        <w:spacing w:line="204" w:lineRule="auto"/>
+        <w:spacing w:line="276" w:lineRule="auto"/>
         <w:jc w:val="both"/>
         <w:rPr>
           <w:rFonts w:ascii="Gadugi" w:hAnsi="Gadugi"/>
@@ -5647,7 +5724,7 @@
     </w:p>
     <w:p>
       <w:pPr>
-        <w:spacing w:line="204" w:lineRule="auto"/>
+        <w:spacing w:line="276" w:lineRule="auto"/>
         <w:jc w:val="both"/>
         <w:rPr>
           <w:rFonts w:ascii="Gadugi" w:hAnsi="Gadugi"/>

</xml_diff>